<commit_message>
docs: correct coverage and test-count figures
The chat authorization test raised the suite to 76 and shifted measured
coverage to 49.4% line / 52.2% instruction on resume-service. README and
the report both cited the pre-fix numbers.

Also adds docs/evidence/test-run.txt, the captured output of a clean
mvn test run, and the report generator script.
</commit_message>
<xml_diff>
--- a/docs/ResumeForge_Capstone_Report.docx
+++ b/docs/ResumeForge_Capstone_Report.docx
@@ -360,7 +360,7 @@
           <w:sz w:val="22"/>
           <w:szCs w:val="22"/>
         </w:rPr>
-        <w:t xml:space="preserve">The system is implemented as three Spring Boot 3.3 services on Java 21, backed by PostgreSQL with Flyway-managed schema migrations and Redis for consumer idempotency. Authentication is stateless JWT; authorization is enforced at the service layer through an ownership check applied to every data-touching operation, and is verified by an automated cross-tenant test suite that drives two distinct users over HTTP. The codebase carries 76 automated tests with measured JaCoCo coverage of 47.2% line and 50.5% instruction on the primary API service.</w:t>
+        <w:t xml:space="preserve">The system is implemented as three Spring Boot 3.3 services on Java 21, backed by PostgreSQL with Flyway-managed schema migrations and Redis for consumer idempotency. Authentication is stateless JWT; authorization is enforced at the service layer through an ownership check applied to every data-touching operation, and is verified by an automated cross-tenant test suite that drives two distinct users over HTTP. The codebase carries 76 automated tests with measured JaCoCo coverage of 49.4% line and 52.2% instruction on the primary API service.</w:t>
       </w:r>
     </w:p>
     <w:p>
@@ -6452,7 +6452,7 @@
           <w:sz w:val="22"/>
           <w:szCs w:val="22"/>
         </w:rPr>
-        <w:t xml:space="preserve">Coverage is measured with JaCoCo rather than estimated. On resume-service it is 47.2% of lines and 50.5% of instructions. The figure is reported honestly, including where it is weak: worker-service and api-gateway have no test suite, so repository-wide coverage is substantially lower than the resume-service figure.</w:t>
+        <w:t xml:space="preserve">Coverage is measured with JaCoCo rather than estimated. On resume-service it is 49.4% of lines and 52.2% of instructions. The figure is reported honestly, including where it is weak: worker-service and api-gateway have no test suite, so repository-wide coverage is substantially lower than the resume-service figure.</w:t>
       </w:r>
     </w:p>
     <w:p>

</xml_diff>